<commit_message>
Replace report overview with supplied full-page screenshot
</commit_message>
<xml_diff>
--- a/HW2-415085047-YEN-TING-YA.docx
+++ b/HW2-415085047-YEN-TING-YA.docx
@@ -103,15 +103,6 @@
       </w:r>
     </w:p>
     <w:p>
-      <w:pPr/>
-      <w:r>
-        <w:rPr>
-          <w:rFonts w:eastAsia="Heiti TC"/>
-        </w:rPr>
-        <w:t>我想把 F1 正賽中的車速、位置與名次變化放在同一個時間基準下觀察，因此選取 2024 年義大利 Monza 站完賽前三名，以 D3.js 製作車速與名次圖，搭配 Three.js 呈現 3D 賽道回放。讀者可以跟隨車手、重播首圈攻防，再放大車速曲線比較細節。</w:t>
-      </w:r>
-    </w:p>
-    <w:p>
       <w:pPr>
         <w:keepNext/>
         <w:spacing w:after="0" w:line="240" w:lineRule="auto"/>
@@ -123,8 +114,8 @@
         </w:rPr>
         <w:drawing>
           <wp:inline xmlns:a="http://schemas.openxmlformats.org/drawingml/2006/main" xmlns:pic="http://schemas.openxmlformats.org/drawingml/2006/picture">
-            <wp:extent cx="6336000" cy="5124706"/>
-            <wp:docPr id="1" name="Picture 1" descr="圖 1　首圈約 34.7 秒的實際畫面　鏡頭跟隨 Piastri 並顯示當時全場排名"/>
+            <wp:extent cx="6336000" cy="6618857"/>
+            <wp:docPr id="1" name="Picture 1" descr="圖 1　起跑前的完整介面　包含 3D 賽道、車手資料、車速曲線與名次變化"/>
             <wp:cNvGraphicFramePr>
               <a:graphicFrameLocks noChangeAspect="1"/>
             </wp:cNvGraphicFramePr>
@@ -144,7 +135,7 @@
                   <pic:spPr>
                     <a:xfrm>
                       <a:off x="0" y="0"/>
-                      <a:ext cx="6336000" cy="5124706"/>
+                      <a:ext cx="6336000" cy="6618857"/>
                     </a:xfrm>
                     <a:prstGeom prst="rect"/>
                   </pic:spPr>
@@ -163,16 +154,7 @@
         <w:rPr>
           <w:rFonts w:eastAsia="Heiti TC"/>
         </w:rPr>
-        <w:t>圖 1　首圈約 34.7 秒的實際畫面　鏡頭跟隨 Piastri 並顯示當時全場排名</w:t>
-      </w:r>
-    </w:p>
-    <w:p>
-      <w:pPr/>
-      <w:r>
-        <w:rPr>
-          <w:rFonts w:eastAsia="Heiti TC"/>
-        </w:rPr>
-        <w:t>單圈長度為 5.793 公里，正賽共 53 圈。網站免登入，可直接透過 GitHub Pages 開啟；這是歷史賽事資料回放，畫面中的即時數值指目前播放時刻的資料。</w:t>
+        <w:t>圖 1　起跑前的完整介面　包含 3D 賽道、車手資料、車速曲線與名次變化</w:t>
       </w:r>
     </w:p>
     <w:p>
@@ -192,6 +174,24 @@
           <w:rFonts w:eastAsia="Heiti TC"/>
         </w:rPr>
         <w:t>資料整理與製作流程</w:t>
+      </w:r>
+    </w:p>
+    <w:p>
+      <w:pPr/>
+      <w:r>
+        <w:rPr>
+          <w:rFonts w:eastAsia="Heiti TC"/>
+        </w:rPr>
+        <w:t>我想把 F1 正賽中的車速、位置與名次變化放在同一個時間基準下觀察，因此選取 2024 年義大利 Monza 站完賽前三名，以 D3.js 製作車速與名次圖，搭配 Three.js 呈現 3D 賽道回放。讀者可以跟隨車手、重播首圈攻防，再放大車速曲線比較細節。</w:t>
+      </w:r>
+    </w:p>
+    <w:p>
+      <w:pPr/>
+      <w:r>
+        <w:rPr>
+          <w:rFonts w:eastAsia="Heiti TC"/>
+        </w:rPr>
+        <w:t>單圈長度為 5.793 公里，正賽共 53 圈。網站免登入，可直接透過 GitHub Pages 開啟；這是歷史賽事資料回放，畫面中的即時數值指目前播放時刻的資料。</w:t>
       </w:r>
     </w:p>
     <w:p>
@@ -559,7 +559,7 @@
         <w:rPr>
           <w:rFonts w:eastAsia="Heiti TC"/>
         </w:rPr>
-        <w:t>圖 1 停在約 34.7 秒，因此列表顯示 Piastri、Norris、Leclerc 的 P1、P2、P3。圖 2 同一區段可看到三人的車速在約 30 秒後下降，再逐步回升；將名次與速度一起看，有助於選定值得重播的時間段，但單靠曲線不足以判斷超車原因。</w:t>
+        <w:t>圖 1 為起跑前的完整介面，列表顯示 Norris P1、Piastri P2、Leclerc P4，車輛停在起跑位置。圖 2 則放大首圈 15 至 45 秒，可看到三人的車速在約 30 秒後下降，再逐步回升；將名次與速度一起看，有助於選定值得重播的時間段，但單靠曲線不足以判斷超車原因。</w:t>
       </w:r>
     </w:p>
     <w:p>

</xml_diff>

<commit_message>
Update F1 demo with lap gaps, pit replay and HW2 report
Add the full-race gap chart, lap-range replay, pit entry markers and recorded pit-lane visualization. Preserve camera follow and speed-chart controls. Refresh the report, screenshots and operation guide; leave the YouTube link blank.

Validation: 20 data and logic tests pass; five report pages rendered and inspected.
</commit_message>
<xml_diff>
--- a/HW2-415085047-YEN-TING-YA.docx
+++ b/HW2-415085047-YEN-TING-YA.docx
@@ -21,7 +21,7 @@
         <w:rPr>
           <w:rFonts w:eastAsia="Heiti TC"/>
         </w:rPr>
-        <w:t>APEX Monza 3D 遙測分析</w:t>
+        <w:t>進站前後的車手差距變化</w:t>
       </w:r>
     </w:p>
     <w:p>
@@ -43,7 +43,16 @@
         <w:rPr>
           <w:rFonts w:eastAsia="Heiti TC"/>
         </w:rPr>
-        <w:t>製作日期 2026 年 10 月 28 日　｜　賽事日期 2024 年 9 月 1 日</w:t>
+        <w:t>更新日期 2026 年 10 月 30 日　｜　賽事日期 2024 年 9 月 1 日</w:t>
+      </w:r>
+    </w:p>
+    <w:p>
+      <w:pPr/>
+      <w:r>
+        <w:rPr>
+          <w:rFonts w:eastAsia="Heiti TC"/>
+        </w:rPr>
+        <w:t>我以 2024 年 Monza 正賽完賽前三名為比較對象，使用整場差距圖呈現進站前後的變化，並連動 3D 賽道回放與車速曲線。讀者可以先找出曲線轉折，再選取圈段觀看車輛動態，不必從頭播放整場比賽。</w:t>
       </w:r>
     </w:p>
     <w:p>
@@ -114,8 +123,8 @@
         </w:rPr>
         <w:drawing>
           <wp:inline xmlns:a="http://schemas.openxmlformats.org/drawingml/2006/main" xmlns:pic="http://schemas.openxmlformats.org/drawingml/2006/picture">
-            <wp:extent cx="6336000" cy="6618857"/>
-            <wp:docPr id="1" name="Picture 1" descr="圖 1　起跑前的完整介面　包含 3D 賽道、車手資料、車速曲線與名次變化"/>
+            <wp:extent cx="6336000" cy="3812940"/>
+            <wp:docPr id="1" name="Picture 1" descr="圖 1　整場差距圖與進站標記　已選取 Piastri 第 38 圈進站片段"/>
             <wp:cNvGraphicFramePr>
               <a:graphicFrameLocks noChangeAspect="1"/>
             </wp:cNvGraphicFramePr>
@@ -123,7 +132,7 @@
               <a:graphicData uri="http://schemas.openxmlformats.org/drawingml/2006/picture">
                 <pic:pic>
                   <pic:nvPicPr>
-                    <pic:cNvPr id="0" name="hw2-overview.png"/>
+                    <pic:cNvPr id="0" name="hw2-gap.jpg"/>
                     <pic:cNvPicPr/>
                   </pic:nvPicPr>
                   <pic:blipFill>
@@ -135,7 +144,7 @@
                   <pic:spPr>
                     <a:xfrm>
                       <a:off x="0" y="0"/>
-                      <a:ext cx="6336000" cy="6618857"/>
+                      <a:ext cx="6336000" cy="3812940"/>
                     </a:xfrm>
                     <a:prstGeom prst="rect"/>
                   </pic:spPr>
@@ -154,7 +163,18 @@
         <w:rPr>
           <w:rFonts w:eastAsia="Heiti TC"/>
         </w:rPr>
-        <w:t>圖 1　起跑前的完整介面　包含 3D 賽道、車手資料、車速曲線與名次變化</w:t>
+        <w:t>圖 1　整場差距圖與進站標記　已選取 Piastri 第 38 圈進站片段</w:t>
+      </w:r>
+    </w:p>
+    <w:p>
+      <w:pPr>
+        <w:pStyle w:val="Small"/>
+      </w:pPr>
+      <w:r>
+        <w:rPr>
+          <w:rFonts w:eastAsia="Heiti TC"/>
+        </w:rPr>
+        <w:t>本文件介紹新增整場差距圖、區段回放與維修區呈現的版本，透過 GitHub Pages 提供免登入使用。截圖擷取自本機預覽，YouTube 影片連結保留空白。</w:t>
       </w:r>
     </w:p>
     <w:p>
@@ -177,24 +197,6 @@
       </w:r>
     </w:p>
     <w:p>
-      <w:pPr/>
-      <w:r>
-        <w:rPr>
-          <w:rFonts w:eastAsia="Heiti TC"/>
-        </w:rPr>
-        <w:t>我想把 F1 正賽中的車速、位置與名次變化放在同一個時間基準下觀察，因此選取 2024 年義大利 Monza 站完賽前三名，以 D3.js 製作車速與名次圖，搭配 Three.js 呈現 3D 賽道回放。讀者可以跟隨車手、重播首圈攻防，再放大車速曲線比較細節。</w:t>
-      </w:r>
-    </w:p>
-    <w:p>
-      <w:pPr/>
-      <w:r>
-        <w:rPr>
-          <w:rFonts w:eastAsia="Heiti TC"/>
-        </w:rPr>
-        <w:t>單圈長度為 5.793 公里，正賽共 53 圈。網站免登入，可直接透過 GitHub Pages 開啟；這是歷史賽事資料回放，畫面中的即時數值指目前播放時刻的資料。</w:t>
-      </w:r>
-    </w:p>
-    <w:p>
       <w:pPr>
         <w:pStyle w:val="Heading2"/>
       </w:pPr>
@@ -211,7 +213,7 @@
         <w:rPr>
           <w:rFonts w:eastAsia="Heiti TC"/>
         </w:rPr>
-        <w:t>使用 OpenF1 的 2024 Monza 正賽資料，session_key 為 9590。依 FIA 最終成績選取 Charles Leclerc（16）、Oscar Piastri（81）及 Lando Norris（4），三人皆完成 53 圈。選樣依據是完賽前三名，並非三人全程都位於前三名。</w:t>
+        <w:t>使用 OpenF1 的 2024 Monza 正賽資料，session_key 為 9590。依 FIA 最終成績選取 Charles Leclerc（16）、Oscar Piastri（81）及 Lando Norris（4），三人皆完成 53 圈。賽道單圈長度為 5.793 公里；選樣依據是完賽前三名，不代表三人全程都位於前三名。</w:t>
       </w:r>
     </w:p>
     <w:p>
@@ -220,7 +222,7 @@
         <w:rPr>
           <w:rFonts w:eastAsia="Heiti TC"/>
         </w:rPr>
-        <w:t>Leclerc 為冠軍，用時 1:14:40.727；Piastri 落後 2.664 秒、Norris 落後 6.153 秒。三位車手在視覺化中分別使用粉紅、紫、橘色，讓同屬 McLaren 的兩位車手仍容易區分。</w:t>
+        <w:t>Leclerc 為冠軍，用時 1:14:40.727；Piastri 落後 2.664 秒，Norris 落後 6.153 秒。圖表固定以粉紅、紫、橘色表示三位車手，方便跨區塊辨識，也能區分同屬 McLaren 的兩人。</w:t>
       </w:r>
     </w:p>
     <w:p>
@@ -231,7 +233,7 @@
         <w:rPr>
           <w:rFonts w:eastAsia="Heiti TC"/>
         </w:rPr>
-        <w:t>整理位置與遙測資料</w:t>
+        <w:t>整理資料並對齊賽事時間</w:t>
       </w:r>
     </w:p>
     <w:p>
@@ -240,7 +242,7 @@
         <w:rPr>
           <w:rFonts w:eastAsia="Heiti TC"/>
         </w:rPr>
-        <w:t>下載車輛位置、車速、油門、煞車、檔位、引擎轉速及 DRS，並合併圈次、全場名次、差距、進站與賽會紀錄。原始資料留在本機開發專案，發布版的 data/race.json 保存整理後資料及來源查詢網址。</w:t>
+        <w:t>下載位置、車速、油門、煞車、檔位、轉速與 DRS，合併圈次、全場名次、差距、進站及賽會紀錄。以 SESSION STARTED 的 2024-09-01T13:03:34.412Z 作共同 0 秒，即 Monza 15:03:34、台灣 21:03:34。三台車使用同一時鐘，保留當時的先後關係。</w:t>
       </w:r>
     </w:p>
     <w:p>
@@ -249,7 +251,7 @@
         <w:rPr>
           <w:rFonts w:eastAsia="Heiti TC"/>
         </w:rPr>
-        <w:t>以賽會紀錄 SESSION STARTED 的 2024-09-01T13:03:34.412Z 作為共同 0 秒，即 Monza 15:03:34、台灣 21:03:34。三位車手使用相同賽事時間，沒有把每個人的單圈各自對齊，因此能保留比賽中的先後關係。</w:t>
+        <w:t>位置與連續遙測整理為每 0.25 秒一筆，離散狀態採最近取樣。資料處理檢查缺口，避免跨越大段缺測。回放面板採該時刻已知的名次、圈次及差距；上方整場圖則提供完整歷史資料供探索。</w:t>
       </w:r>
     </w:p>
     <w:p>
@@ -260,7 +262,7 @@
         <w:rPr>
           <w:rFonts w:eastAsia="Heiti TC"/>
         </w:rPr>
-        <w:t>對齊時間並建立回放</w:t>
+        <w:t>計算逐圈差距並連動回放</w:t>
       </w:r>
     </w:p>
     <w:p>
@@ -269,7 +271,7 @@
         <w:rPr>
           <w:rFonts w:eastAsia="Heiti TC"/>
         </w:rPr>
-        <w:t>位置及連續遙測整理成每 0.25 秒一筆；煞車、檔位、DRS 等離散狀態採最近取樣。資料處理會檢查取樣缺口，避免跨過大段缺值。名次、圈次及差距使用當時已知紀錄，不提前讀取下一個時間點。</w:t>
+        <w:t>先用每圈起始時間加該圈圈速，重建通過終點的時刻，再減去 Leclerc 同圈過線時刻。差值為正代表落後，為負代表領先；圖上以零線區分上下，缺值不補成零。這是同圈完成時的比較，與右側距當時全場領先者的差距不同。</w:t>
       </w:r>
     </w:p>
     <w:p>
@@ -278,7 +280,7 @@
         <w:rPr>
           <w:rFonts w:eastAsia="Heiti TC"/>
         </w:rPr>
-        <w:t>賽道輪廓取自 Leclerc 第 3 圈的位置軌跡，再用 Three.js 建立道路與簡化賽車。播放時按共同時鐘更新三台車的位置及朝向，鏡頭可跟隨選中的車手；車身大小與賽道呈現屬視覺示意。</w:t>
+        <w:t>D3.js 使用線性比例尺、折線與資料綁定繪製差距圖和車速曲線，加入 hover 查值、進站標記及 Pointer Events 圈段選取。gap-model.js 計算差距和回放範圍，gap-chart.js 處理圖表操作；app.js 共用目前時間與選中車手，連動 3D 場景和面板。</w:t>
       </w:r>
     </w:p>
     <w:p>
@@ -289,7 +291,7 @@
         <w:rPr>
           <w:rFonts w:eastAsia="Heiti TC"/>
         </w:rPr>
-        <w:t>用 D3 建立聯動圖表</w:t>
+        <w:t>建立賽道與維修區呈現</w:t>
       </w:r>
     </w:p>
     <w:p>
@@ -298,16 +300,7 @@
         <w:rPr>
           <w:rFonts w:eastAsia="Heiti TC"/>
         </w:rPr>
-        <w:t>D3.js 以資料綁定建立車手列表與曲線，使用 d3.scaleLinear() 對應時間、車速與名次。車速圖用 d3.line()；名次圖用 d3.curveStepAfter，表示名次在紀錄更新後改變，而非平滑地經過小數名次。列表依當時全場名次重新排序。</w:t>
-      </w:r>
-    </w:p>
-    <w:p>
-      <w:pPr/>
-      <w:r>
-        <w:rPr>
-          <w:rFonts w:eastAsia="Heiti TC"/>
-        </w:rPr>
-        <w:t>app.js 管理播放、選取及 D3 圖表；scene.js 負責 Three.js 場景與鏡頭；model.js 負責取樣與時間視窗計算。各區塊共用目前時間及選中車手，讓點選與播放保持一致。</w:t>
+        <w:t>以 Leclerc 第 3 圈軌跡建立賽道輪廓，Three.js 負責道路、簡化賽車與鏡頭。車輛沿各自完整正賽座標移動。pits.js 依進站紀錄估算進出站區間，取實際通行軌跡畫成金色 PIT LANE；進站時，車牌、排名列表與資料面板同步顯示狀態。</w:t>
       </w:r>
     </w:p>
     <w:p>
@@ -318,7 +311,7 @@
         <w:rPr>
           <w:rFonts w:eastAsia="Heiti TC"/>
         </w:rPr>
-        <w:t>驗證並發布網站</w:t>
+        <w:t>驗證功能與保存版本</w:t>
       </w:r>
     </w:p>
     <w:p>
@@ -327,7 +320,7 @@
         <w:rPr>
           <w:rFonts w:eastAsia="Heiti TC"/>
         </w:rPr>
-        <w:t>檢查共同時鐘、圈次、起跑與完賽名次、插值及時間視窗計算，並在瀏覽器驗證倒數、重置、選車、跟隨、曲線篩選與縮放拖曳。最後將靜態網頁、資料及函式庫一併上傳 GitHub，透過 main 分支的根目錄發布至 GitHub Pages。</w:t>
+        <w:t>新版通過 20 項資料與邏輯檢查，涵蓋共同時鐘、圈次、插值、時間視窗、逐圈差距、片段範圍及進站狀態。瀏覽器另驗證點選、框選、片段結束暫停、末圈重播、重置與手機寬度顯示。網站採用 GitHub Pages 提供免登入使用；本機 dist 目錄保留可預覽的靜態網頁、資料與函式庫。</w:t>
       </w:r>
     </w:p>
     <w:p>
@@ -346,18 +339,7 @@
         <w:rPr>
           <w:rFonts w:eastAsia="Heiti TC"/>
         </w:rPr>
-        <w:t>互動操作與示範</w:t>
-      </w:r>
-    </w:p>
-    <w:p>
-      <w:pPr>
-        <w:pStyle w:val="Heading2"/>
-      </w:pPr>
-      <w:r>
-        <w:rPr>
-          <w:rFonts w:eastAsia="Heiti TC"/>
-        </w:rPr>
-        <w:t>播放比賽並跟隨車手</w:t>
+        <w:t>整場差距圖與進站回放操作</w:t>
       </w:r>
     </w:p>
     <w:p>
@@ -368,7 +350,7 @@
         <w:rPr>
           <w:rFonts w:eastAsia="Heiti TC"/>
         </w:rPr>
-        <w:t>1. 開啟互動網站，車輛停在起跑位置，預設 1× 並開啟「跟隨車手」。按「播放」後，左上角倒數 3 秒才發車；按「重置比賽」回到起跑前，再次播放會重新倒數。</w:t>
+        <w:t>1. 先看「進站前後的車手差距變化」。橫軸是第 1 至 53 圈，零線是 Leclerc；上方表示領先，下方表示落後。滑鼠移到圖上，下方資料區顯示該圈差距、圈速及進站圈或出站圈。白色游標表示 Leclerc 的回放進度。</w:t>
       </w:r>
     </w:p>
     <w:p>
@@ -379,7 +361,7 @@
         <w:rPr>
           <w:rFonts w:eastAsia="Heiti TC"/>
         </w:rPr>
-        <w:t>2. 點車輛、車手標籤或右側列表，可切換資料面板與跟隨對象。面板顯示車速、油門、煞車、檔位、轉速、DRS、目前圈數及全場名次。</w:t>
+        <w:t>2. 點選圈次會暫停並定位；左右拖曳可框選多圈。按「播放這段」後，回放從三位車手中最早開始選定圈的時間，持續至最晚完成末圈的時間，結束自動暫停。按「清除區段」恢復整場播放控制。</w:t>
       </w:r>
     </w:p>
     <w:p>
@@ -390,29 +372,7 @@
         <w:rPr>
           <w:rFonts w:eastAsia="Heiti TC"/>
         </w:rPr>
-        <w:t>3. 在「平移」模式拖曳可上下左右移動畫面；切換「旋轉」可改變角度，滾輪可拉近或拉遠。手動平移會解除跟隨；旋轉與縮放保留跟隨。「對準車手」僅在未跟隨時顯示。</w:t>
-      </w:r>
-    </w:p>
-    <w:p>
-      <w:pPr>
-        <w:spacing w:after="80"/>
-      </w:pPr>
-      <w:r>
-        <w:rPr>
-          <w:rFonts w:eastAsia="Heiti TC"/>
-        </w:rPr>
-        <w:t>4. 按「首圈超車」直接播放 Piastri 超越 Norris 前約 10 秒，並跟隨 Piastri。需要慢看時可選 0.5× 或 0.25×；也可用圈次或名次變化選單定位。</w:t>
-      </w:r>
-    </w:p>
-    <w:p>
-      <w:pPr>
-        <w:pStyle w:val="Heading2"/>
-      </w:pPr>
-      <w:r>
-        <w:rPr>
-          <w:rFonts w:eastAsia="Heiti TC"/>
-        </w:rPr>
-        <w:t>放大車速曲線並比較名次</w:t>
+        <w:t>3. 點圖上的 P 標記，選取對應車手並定位進站前 8 秒；片段包含出站後 8 秒。若已開啟「跟隨車手」，鏡頭會繼續跟隨。圖 1 選取的 Piastri 第二次進站片段約為 53:34 至 54:14。</w:t>
       </w:r>
     </w:p>
     <w:p>
@@ -427,8 +387,8 @@
         </w:rPr>
         <w:drawing>
           <wp:inline xmlns:a="http://schemas.openxmlformats.org/drawingml/2006/main" xmlns:pic="http://schemas.openxmlformats.org/drawingml/2006/picture">
-            <wp:extent cx="6336000" cy="2018824"/>
-            <wp:docPr id="2" name="Picture 2" descr="圖 2　15 至 45 秒的車速曲線與整場名次圖　虛線標示目前播放時刻"/>
+            <wp:extent cx="5616000" cy="4755383"/>
+            <wp:docPr id="2" name="Picture 2" descr="圖 2　回放 53:52 的進站狀態　Piastri 已進入第 39 圈　金色帶為維修區軌跡示意"/>
             <wp:cNvGraphicFramePr>
               <a:graphicFrameLocks noChangeAspect="1"/>
             </wp:cNvGraphicFramePr>
@@ -436,7 +396,7 @@
               <a:graphicData uri="http://schemas.openxmlformats.org/drawingml/2006/picture">
                 <pic:pic>
                   <pic:nvPicPr>
-                    <pic:cNvPr id="0" name="hw2-charts.png"/>
+                    <pic:cNvPr id="0" name="hw2-pit.jpg"/>
                     <pic:cNvPicPr/>
                   </pic:nvPicPr>
                   <pic:blipFill>
@@ -448,7 +408,7 @@
                   <pic:spPr>
                     <a:xfrm>
                       <a:off x="0" y="0"/>
-                      <a:ext cx="6336000" cy="2018824"/>
+                      <a:ext cx="5616000" cy="4755383"/>
                     </a:xfrm>
                     <a:prstGeom prst="rect"/>
                   </pic:spPr>
@@ -467,7 +427,7 @@
         <w:rPr>
           <w:rFonts w:eastAsia="Heiti TC"/>
         </w:rPr>
-        <w:t>圖 2　15 至 45 秒的車速曲線與整場名次圖　虛線標示目前播放時刻</w:t>
+        <w:t>圖 2　回放 53:52 的進站狀態　Piastri 已進入第 39 圈　金色帶為維修區軌跡示意</w:t>
       </w:r>
     </w:p>
     <w:p>
@@ -478,40 +438,7 @@
         <w:rPr>
           <w:rFonts w:eastAsia="Heiti TC"/>
         </w:rPr>
-        <w:t>5. 使用 LEC、PIA、NOR 的 checkbox 各自顯示或隱藏曲線。時間範圍可切換 30、60、120 秒、5 分鐘、10 分鐘或整場；圖 2 選擇 30 秒。</w:t>
-      </w:r>
-    </w:p>
-    <w:p>
-      <w:pPr>
-        <w:spacing w:after="80"/>
-      </w:pPr>
-      <w:r>
-        <w:rPr>
-          <w:rFonts w:eastAsia="Heiti TC"/>
-        </w:rPr>
-        <w:t>6. 在車速圖內使用滾輪，以滑鼠指向的時間為中心縮放；可視範圍最小 5 秒，旁邊同步顯示目前秒數。左右拖曳圖表或下方定位滑桿可移到其他區段。</w:t>
-      </w:r>
-    </w:p>
-    <w:p>
-      <w:pPr>
-        <w:spacing w:after="80"/>
-      </w:pPr>
-      <w:r>
-        <w:rPr>
-          <w:rFonts w:eastAsia="Heiti TC"/>
-        </w:rPr>
-        <w:t>7. 拖曳或縮放會切為自由瀏覽，不改變比賽播放時間，也不解除 3D 鏡頭跟隨。勾回「跟隨播放」，車速圖才會重新隨目前時間捲動。</w:t>
-      </w:r>
-    </w:p>
-    <w:p>
-      <w:pPr>
-        <w:spacing w:after="80"/>
-      </w:pPr>
-      <w:r>
-        <w:rPr>
-          <w:rFonts w:eastAsia="Heiti TC"/>
-        </w:rPr>
-        <w:t>8. 滑鼠移到車速圖可查看時間與各車手數值；名次圖可讀取該時刻排名。點擊任一圖表會暫停並跳至該時間，同步更新車輛與資料面板。</w:t>
+        <w:t>4. 進站會跨過計時線，例如第 38 圈進站、第 39 圈出站，耗時可能反映在下一圈。金色軌跡、車牌與右側「進站中」可協助辨識。顯示的通行約 24.6 秒包含行駛和停車，不是單純換胎秒數。</w:t>
       </w:r>
     </w:p>
     <w:p>
@@ -530,7 +457,7 @@
         <w:rPr>
           <w:rFonts w:eastAsia="Heiti TC"/>
         </w:rPr>
-        <w:t>圖表觀察與資料限制</w:t>
+        <w:t>鏡頭操作與車速細節</w:t>
       </w:r>
     </w:p>
     <w:p>
@@ -541,7 +468,7 @@
         <w:rPr>
           <w:rFonts w:eastAsia="Heiti TC"/>
         </w:rPr>
-        <w:t>從首圈回放觀察名次改變</w:t>
+        <w:t>播放與切換觀察對象</w:t>
       </w:r>
     </w:p>
     <w:p>
@@ -550,7 +477,7 @@
         <w:rPr>
           <w:rFonts w:eastAsia="Heiti TC"/>
         </w:rPr>
-        <w:t>初始排名為 Norris P1、Piastri P2、Leclerc P4。資料約在 26.2 秒記錄 Leclerc 升至 P3，32.3 秒記錄 Piastri 由 P2 升至 P1，41.6 秒再記錄 Leclerc 由 P3 升至 P2。這些時間是名次紀錄的更新點，不等於精確的物理超越瞬間。</w:t>
+        <w:t>初次開啟停在起跑位置，預設 1× 並開啟「跟隨車手」。按播放後倒數 3 秒才發車；重置回到起跑前，並清除選取區段。可用 0.5× 或 0.25× 慢看，也可加速播放。點車輛、標籤或右側列表會切換所選車手，列表依當時全場名次排序。</w:t>
       </w:r>
     </w:p>
     <w:p>
@@ -559,7 +486,7 @@
         <w:rPr>
           <w:rFonts w:eastAsia="Heiti TC"/>
         </w:rPr>
-        <w:t>圖 1 為起跑前的完整介面，列表顯示 Norris P1、Piastri P2、Leclerc P4，車輛停在起跑位置。圖 2 則放大首圈 15 至 45 秒，可看到三人的車速在約 30 秒後下降，再逐步回升；將名次與速度一起看，有助於選定值得重播的時間段，但單靠曲線不足以判斷超車原因。</w:t>
+        <w:t>「平移」模式可上下左右拖曳；「旋轉」模式可調整角度，滾輪拉近或拉遠。平移會解除鏡頭跟隨，旋轉與縮放保留跟隨；「對準車手」只在未跟隨時顯示。可用「首圈超車」、圈次或名次變化選單定位，也可按「整場差距圖」回到上方。</w:t>
       </w:r>
     </w:p>
     <w:p>
@@ -570,7 +497,183 @@
         <w:rPr>
           <w:rFonts w:eastAsia="Heiti TC"/>
         </w:rPr>
-        <w:t>解讀時需要保留的限制</w:t>
+        <w:t>放大區段並比較車速</w:t>
+      </w:r>
+    </w:p>
+    <w:p>
+      <w:pPr>
+        <w:keepNext/>
+        <w:spacing w:after="0" w:line="240" w:lineRule="auto"/>
+        <w:jc w:val="center"/>
+      </w:pPr>
+      <w:r>
+        <w:rPr>
+          <w:rFonts w:eastAsia="Heiti TC"/>
+        </w:rPr>
+        <w:drawing>
+          <wp:inline xmlns:a="http://schemas.openxmlformats.org/drawingml/2006/main" xmlns:pic="http://schemas.openxmlformats.org/drawingml/2006/picture">
+            <wp:extent cx="6336000" cy="2622282"/>
+            <wp:docPr id="3" name="Picture 3" descr="圖 3　52:30 至 54:30 的車速曲線　游標停在 53:52　Piastri 此時車速為 0"/>
+            <wp:cNvGraphicFramePr>
+              <a:graphicFrameLocks noChangeAspect="1"/>
+            </wp:cNvGraphicFramePr>
+            <a:graphic>
+              <a:graphicData uri="http://schemas.openxmlformats.org/drawingml/2006/picture">
+                <pic:pic>
+                  <pic:nvPicPr>
+                    <pic:cNvPr id="0" name="hw2-speed.jpg"/>
+                    <pic:cNvPicPr/>
+                  </pic:nvPicPr>
+                  <pic:blipFill>
+                    <a:blip r:embed="rId13"/>
+                    <a:stretch>
+                      <a:fillRect/>
+                    </a:stretch>
+                  </pic:blipFill>
+                  <pic:spPr>
+                    <a:xfrm>
+                      <a:off x="0" y="0"/>
+                      <a:ext cx="6336000" cy="2622282"/>
+                    </a:xfrm>
+                    <a:prstGeom prst="rect"/>
+                  </pic:spPr>
+                </pic:pic>
+              </a:graphicData>
+            </a:graphic>
+          </wp:inline>
+        </w:drawing>
+      </w:r>
+    </w:p>
+    <w:p>
+      <w:pPr>
+        <w:pStyle w:val="Caption"/>
+      </w:pPr>
+      <w:r>
+        <w:rPr>
+          <w:rFonts w:eastAsia="Heiti TC"/>
+        </w:rPr>
+        <w:t>圖 3　52:30 至 54:30 的車速曲線　游標停在 53:52　Piastri 此時車速為 0</w:t>
+      </w:r>
+    </w:p>
+    <w:p>
+      <w:pPr>
+        <w:spacing w:after="80"/>
+      </w:pPr>
+      <w:r>
+        <w:rPr>
+          <w:rFonts w:eastAsia="Heiti TC"/>
+        </w:rPr>
+        <w:t>5. LEC、PIA、NOR 的 checkbox 可獨立顯示或隱藏曲線。時間範圍可選 30、60、120 秒、5 分鐘、10 分鐘或整場；圖 3 使用 120 秒。</w:t>
+      </w:r>
+    </w:p>
+    <w:p>
+      <w:pPr>
+        <w:spacing w:after="80"/>
+      </w:pPr>
+      <w:r>
+        <w:rPr>
+          <w:rFonts w:eastAsia="Heiti TC"/>
+        </w:rPr>
+        <w:t>6. 在車速圖上滾輪縮放，以滑鼠指向的時間為中心，最小 5 秒；時間範圍同步顯示目前秒數。左右拖曳圖表或下方滑桿可瀏覽其他區段。</w:t>
+      </w:r>
+    </w:p>
+    <w:p>
+      <w:pPr>
+        <w:spacing w:after="80"/>
+      </w:pPr>
+      <w:r>
+        <w:rPr>
+          <w:rFonts w:eastAsia="Heiti TC"/>
+        </w:rPr>
+        <w:t>7. 拖曳或縮放會固定車速視窗，不改變比賽時間或鏡頭跟隨。勾回「跟隨播放」即可重新隨播放捲動。Hover 查看時間及車速；點車速圖會暫停並跳到該時刻，清除原先的圈段選取。</w:t>
+      </w:r>
+    </w:p>
+    <w:p>
+      <w:pPr>
+        <w:pStyle w:val="Heading2"/>
+      </w:pPr>
+      <w:r>
+        <w:rPr>
+          <w:rFonts w:eastAsia="Heiti TC"/>
+        </w:rPr>
+        <w:t>從圖表觀察進站前後的變化</w:t>
+      </w:r>
+    </w:p>
+    <w:p>
+      <w:pPr/>
+      <w:r>
+        <w:rPr>
+          <w:rFonts w:eastAsia="Heiti TC"/>
+        </w:rPr>
+        <w:t>Piastri 在第 38 圈第二次進站，第 39 圈出站。重建差距顯示，他在第 38 圈結束時領先 Leclerc 約 1.0 秒，第 39 圈結束時落後約 18.6 秒，之後逐步縮小差距，第 53 圈約落後 2.6 秒。可以先找曲線轉折，再回放進站片段，並用車速圖查看減速與停車過程。</w:t>
+      </w:r>
+    </w:p>
+    <w:p>
+      <w:pPr/>
+      <w:r>
+        <w:rPr>
+          <w:rFonts w:eastAsia="Heiti TC"/>
+        </w:rPr>
+        <w:t>這些圖表呈現差距隨比賽發展的變化，讓回放具有可比較的脈絡；但不能單靠進站次數、排名或車速，斷定勝負完全由某一項因素造成。</w:t>
+      </w:r>
+    </w:p>
+    <w:p>
+      <w:r>
+        <w:rPr>
+          <w:rFonts w:eastAsia="Heiti TC"/>
+        </w:rPr>
+        <w:br w:type="page"/>
+      </w:r>
+    </w:p>
+    <w:p>
+      <w:pPr>
+        <w:pStyle w:val="Heading1"/>
+      </w:pPr>
+      <w:r>
+        <w:rPr>
+          <w:rFonts w:eastAsia="Heiti TC"/>
+        </w:rPr>
+        <w:t>資料限制與來源</w:t>
+      </w:r>
+    </w:p>
+    <w:p>
+      <w:pPr>
+        <w:pStyle w:val="Heading2"/>
+      </w:pPr>
+      <w:r>
+        <w:rPr>
+          <w:rFonts w:eastAsia="Heiti TC"/>
+        </w:rPr>
+        <w:t>時間差與進站紀錄的精度</w:t>
+      </w:r>
+    </w:p>
+    <w:p>
+      <w:pPr/>
+      <w:r>
+        <w:rPr>
+          <w:rFonts w:eastAsia="Heiti TC"/>
+        </w:rPr>
+        <w:t>逐圈差距比較同一圈通過終點的時間，不是每一瞬間的即時車距。圖表以「約」及一位小數呈現；終圈 Piastri 重建為 +2.582 秒，官方為 +2.664 秒；Norris 重建為 +6.308 秒，官方為 +6.153 秒。因此終圈另列官方結果，不將重建值冒充官方毫秒計時。</w:t>
+      </w:r>
+    </w:p>
+    <w:p>
+      <w:pPr/>
+      <w:r>
+        <w:rPr>
+          <w:rFonts w:eastAsia="Heiti TC"/>
+        </w:rPr>
+        <w:t>這批 OpenF1 進站時間戳接近出站時刻，入口以該時間減去 lane_duration 估算，可能有秒級誤差。通行時間包含維修區內行駛與停車；本場資料沒有獨立的換胎停車秒數。五次紀錄為 Norris 第 14、32 圈，Leclerc 第 15 圈，以及 Piastri 第 16、38 圈。</w:t>
+      </w:r>
+    </w:p>
+    <w:p>
+      <w:pPr>
+        <w:pStyle w:val="Heading2"/>
+      </w:pPr>
+      <w:r>
+        <w:rPr>
+          <w:rFonts w:eastAsia="Heiti TC"/>
+        </w:rPr>
+        <w:t>視覺重建的解讀範圍</w:t>
       </w:r>
     </w:p>
     <w:p>
@@ -581,7 +684,7 @@
         <w:rPr>
           <w:rFonts w:eastAsia="Heiti TC"/>
         </w:rPr>
-        <w:t>只顯示完賽前三名的車輛與曲線，其他車手仍會影響他們的全場名次；右側不把三人重新編成固定的 1 至 3 名。</w:t>
+        <w:t>只顯示完賽前三名，其他車手仍影響其全場名次。起跑時 Norris 為 P1、Piastri 為 P2、Leclerc 為 P4，沒有把顯示的三人重新編成固定 P1 至 P3。</w:t>
       </w:r>
     </w:p>
     <w:p>
@@ -592,7 +695,7 @@
         <w:rPr>
           <w:rFonts w:eastAsia="Heiti TC"/>
         </w:rPr>
-        <w:t>3D 道路與賽車是位置資料的視覺重建，車身及間距為辨識而調整，不能用來測量精確車距、左右行車線、碰撞或賽道高程。</w:t>
+        <w:t>車身與主路寬度為辨識而放大，金色維修區軌跡可能落在放大的主路面內。位置與車輛屬示意，不能量測精確車距、左右路線、碰撞或高程。</w:t>
       </w:r>
     </w:p>
     <w:p>
@@ -603,7 +706,7 @@
         <w:rPr>
           <w:rFonts w:eastAsia="Heiti TC"/>
         </w:rPr>
-        <w:t>位置與遙測含插值；名次來源採離散更新，可能出現短暫重複排名。圈次起始時間也有近似誤差，官方完賽結果與回放估算時間分別保留。</w:t>
+        <w:t>名次資料採離散更新，可能短暫重複；右側差距缺值、過時或尚未配合新名次更新時顯示「—」。進站前後的名次變化不全是賽道超車。</w:t>
       </w:r>
     </w:p>
     <w:p>
@@ -614,18 +717,7 @@
         <w:rPr>
           <w:rFonts w:eastAsia="Heiti TC"/>
         </w:rPr>
-        <w:t>差距缺值、過時或尚未配合新名次更新時顯示「—」，不表示差距為零。名次變化也可能由進站或其他賽事因素造成，不能全部當作賽道超車。</w:t>
-      </w:r>
-    </w:p>
-    <w:p>
-      <w:pPr>
-        <w:pStyle w:val="ListBullet"/>
-      </w:pPr>
-      <w:r>
-        <w:rPr>
-          <w:rFonts w:eastAsia="Heiti TC"/>
-        </w:rPr>
-        <w:t>OpenF1 為非官方資料專案。本站使用預先整理的歷史資料，不是即時賽事直播，也不是賽車物理模擬器。</w:t>
+        <w:t>OpenF1 為非官方資料專案；本站使用預先整理的歷史資料，並非即時直播。網站不需要登入或外部 API 金鑰。</w:t>
       </w:r>
     </w:p>
     <w:p>
@@ -636,23 +728,14 @@
         <w:rPr>
           <w:rFonts w:eastAsia="Heiti TC"/>
         </w:rPr>
-        <w:t>資料來源與技術說明</w:t>
-      </w:r>
-    </w:p>
-    <w:p>
-      <w:pPr/>
-      <w:r>
-        <w:rPr>
-          <w:rFonts w:eastAsia="Heiti TC"/>
-        </w:rPr>
-        <w:t>以下來源分別用於資料欄位、賽道資訊與完賽結果核對。整理後的 JSON 內含本次資料查詢網址；網站頁尾亦可展開「資料來源與方法」。</w:t>
+        <w:t>資料來源與技術分工</w:t>
       </w:r>
     </w:p>
     <w:p>
       <w:pPr>
         <w:pStyle w:val="Reference"/>
       </w:pPr>
-      <w:hyperlink r:id="rId13">
+      <w:hyperlink r:id="rId14">
         <w:r>
           <w:rPr>
             <w:color w:val="204D74"/>
@@ -667,21 +750,6 @@
       <w:pPr>
         <w:pStyle w:val="Reference"/>
       </w:pPr>
-      <w:hyperlink r:id="rId14">
-        <w:r>
-          <w:rPr>
-            <w:color w:val="204D74"/>
-            <w:u w:val="single"/>
-            <w:sz w:val="17"/>
-          </w:rPr>
-          <w:t>Formula 1 2024 義大利站賽事與賽道資訊</w:t>
-        </w:r>
-      </w:hyperlink>
-    </w:p>
-    <w:p>
-      <w:pPr>
-        <w:pStyle w:val="Reference"/>
-      </w:pPr>
       <w:hyperlink r:id="rId15">
         <w:r>
           <w:rPr>
@@ -689,7 +757,7 @@
             <w:u w:val="single"/>
             <w:sz w:val="17"/>
           </w:rPr>
-          <w:t>FIA 2024 Italian Grand Prix Final Race Classification</w:t>
+          <w:t>Formula 1 2024 義大利站與賽道資訊</w:t>
         </w:r>
       </w:hyperlink>
     </w:p>
@@ -704,7 +772,52 @@
             <w:u w:val="single"/>
             <w:sz w:val="17"/>
           </w:rPr>
-          <w:t>本專案整理後正賽資料與查詢來源</w:t>
+          <w:t>FIA 2024 義大利站完賽結果</w:t>
+        </w:r>
+      </w:hyperlink>
+    </w:p>
+    <w:p>
+      <w:pPr>
+        <w:pStyle w:val="Reference"/>
+      </w:pPr>
+      <w:hyperlink r:id="rId18">
+        <w:r>
+          <w:rPr>
+            <w:color w:val="204D74"/>
+            <w:u w:val="single"/>
+            <w:sz w:val="17"/>
+          </w:rPr>
+          <w:t>FIA 2024 義大利站進站紀錄</w:t>
+        </w:r>
+      </w:hyperlink>
+    </w:p>
+    <w:p>
+      <w:pPr>
+        <w:pStyle w:val="Reference"/>
+      </w:pPr>
+      <w:hyperlink r:id="rId19">
+        <w:r>
+          <w:rPr>
+            <w:color w:val="204D74"/>
+            <w:u w:val="single"/>
+            <w:sz w:val="17"/>
+          </w:rPr>
+          <w:t>FIA 2024 義大利站賽道與維修區配置</w:t>
+        </w:r>
+      </w:hyperlink>
+    </w:p>
+    <w:p>
+      <w:pPr>
+        <w:pStyle w:val="Reference"/>
+      </w:pPr>
+      <w:hyperlink r:id="rId20">
+        <w:r>
+          <w:rPr>
+            <w:color w:val="204D74"/>
+            <w:u w:val="single"/>
+            <w:sz w:val="17"/>
+          </w:rPr>
+          <w:t>專案整理後正賽資料與查詢來源</w:t>
         </w:r>
       </w:hyperlink>
     </w:p>
@@ -716,7 +829,7 @@
         <w:rPr>
           <w:rFonts w:eastAsia="Heiti TC"/>
         </w:rPr>
-        <w:t>D3.js 7.9.0 負責 SVG 圖表、資料綁定與聯動；Three.js 0.180.0、WebGL 及 OrbitControls 負責 3D 場景與鏡頭。因此本作業有使用 D3.js，但不是純 D3.js 實作。函式庫及 ISC／MIT 授權文件保存於 vendor。</w:t>
+        <w:t>D3.js 7.9.0 負責 SVG 圖表、資料綁定、排序與聯動；Three.js 0.180.0、WebGL 及 OrbitControls 負責 3D 場景與鏡頭。本作業有使用 D3.js，但不是純 D3.js 實作；函式庫與 ISC／MIT 授權文件保留於 vendor。</w:t>
       </w:r>
     </w:p>
     <w:p>
@@ -727,7 +840,7 @@
         <w:rPr>
           <w:rFonts w:eastAsia="Heiti TC"/>
         </w:rPr>
-        <w:t>本專案使用 AI 協助程式撰寫、除錯與文件整理；資料取自上述來源，截圖擷取自已部署網站。Word 文件與 Markdown 由同一份內容產生。</w:t>
+        <w:t>本專案使用 AI 協助程式撰寫、除錯與文件整理；資料取自上述來源。圖 1 至圖 3 均為新版免登入本機預覽截圖。Word 與 Markdown 由同一份內容產生，PDF 為 Word 的排版匯出版本。</w:t>
       </w:r>
     </w:p>
     <w:sectPr>

</xml_diff>